<commit_message>
Attribute publication materials to Wei Roy Wang
</commit_message>
<xml_diff>
--- a/HyperUnit_Network_White_Paper_v1.2_EN.docx
+++ b/HyperUnit_Network_White_Paper_v1.2_EN.docx
@@ -184,25 +184,22 @@
           <w:lang w:eastAsia="zh-CN"/>
         </w:rPr>
       </w:pPr>
-      <w:proofErr w:type="spellStart"/>
-      <w:r>
-        <w:rPr>
-          <w:rFonts w:cs="Noto Serif CJK SC"/>
+      <w:r>
+        <w:rPr>
+          <w:rFonts w:ascii="Noto Sans CJK SC" w:hAnsi="Noto Sans CJK SC" w:eastAsia="Noto Sans CJK SC"/>
           <w:color w:val="687579"/>
           <w:sz w:val="20"/>
-          <w:lang w:bidi="en-US"/>
-        </w:rPr>
-        <w:t>HyperUnit</w:t>
-      </w:r>
-      <w:proofErr w:type="spellEnd"/>
-      <w:r>
-        <w:rPr>
-          <w:rFonts w:cs="Noto Serif CJK SC"/>
+        </w:rPr>
+        <w:t>Author: Wei Roy Wang · HyperUnit Network Project Team</w:t>
+        <w:br/>
+      </w:r>
+      <w:r>
+        <w:rPr>
+          <w:rFonts w:ascii="Noto Sans CJK SC" w:hAnsi="Noto Sans CJK SC" w:eastAsia="Noto Sans CJK SC"/>
           <w:color w:val="687579"/>
-          <w:sz w:val="20"/>
-          <w:lang w:bidi="en-US"/>
-        </w:rPr>
-        <w:t xml:space="preserve"> Network Project Team</w:t>
+          <w:sz w:val="16"/>
+        </w:rPr>
+        <w:t>GitHub: github.com/aspttwwly · Copyright © 2026 Wei Roy Wang. All rights reserved.</w:t>
       </w:r>
     </w:p>
     <w:p>

</xml_diff>